<commit_message>
update docs thuyết trình
</commit_message>
<xml_diff>
--- a/Kịch bản thuyết trình học máy cơ bản.docx
+++ b/Kịch bản thuyết trình học máy cơ bản.docx
@@ -18783,7 +18783,19 @@
       </w:r>
       <w:proofErr w:type="spellEnd"/>
       <w:r>
-        <w:t xml:space="preserve">. $\implies 10 \times 3 = 30$ </w:t>
+        <w:t xml:space="preserve">. </w:t>
+      </w:r>
+      <w:r>
+        <w:t>=&gt;</w:t>
+      </w:r>
+      <w:r>
+        <w:t xml:space="preserve"> 10</w:t>
+      </w:r>
+      <w:r>
+        <w:t>x</w:t>
+      </w:r>
+      <w:r>
+        <w:t xml:space="preserve">3=30 </w:t>
       </w:r>
       <w:proofErr w:type="spellStart"/>
       <w:r>
@@ -26892,7 +26904,7 @@
     <w:p>
       <w:r>
         <w:pict w14:anchorId="3252E1F8">
-          <v:rect id="_x0000_i1073" style="width:199.5pt;height:.75pt" o:hrpct="0" o:hralign="center" o:hrstd="t" o:hr="t" fillcolor="#a0a0a0" stroked="f"/>
+          <v:rect id="_x0000_i1025" style="width:199.5pt;height:.75pt" o:hrpct="0" o:hralign="center" o:hrstd="t" o:hr="t" fillcolor="#a0a0a0" stroked="f"/>
         </w:pict>
       </w:r>
     </w:p>
@@ -34746,6 +34758,7 @@
   <w:style w:type="character" w:default="1" w:styleId="DefaultParagraphFont">
     <w:name w:val="Default Paragraph Font"/>
     <w:uiPriority w:val="1"/>
+    <w:semiHidden/>
     <w:unhideWhenUsed/>
   </w:style>
   <w:style w:type="table" w:default="1" w:styleId="TableNormal">

</xml_diff>